<commit_message>
docs: add The Loop and The Wider Platform sections, brand-coloured mentions of the name throughout
The Loop ties the founder's own 25-year learning insight (Our Story) to a real, verified product mechanism: score below 70% surfaces the weakest topic straight into Learn, then back into another interview. The Wider Platform lists the ten other shipped features (Career Coach, Careers Explorer, Talk Practice, Client Gifts, Exams & Certifications, CV Analyser, Interview Gifts, Question Bank, Company-Specific Interviews, Learn Alerts) plus the jobs board as a named future item, positioned near the end per Francis's request. Every mention of TheInterviewChair.com in body text now renders in the site's own colours.

Co-Authored-By: Claude Sonnet 5 <noreply@anthropic.com>
</commit_message>
<xml_diff>
--- a/docs/business-plan/TheInterviewChair-Business-Plan.docx
+++ b/docs/business-plan/TheInterviewChair-Business-Plan.docx
@@ -116,7 +116,49 @@
           <w:sz w:val="22"/>
           <w:szCs w:val="22"/>
         </w:rPr>
-        <w:t xml:space="preserve">Founder, TheInterviewChair.com</w:t>
+        <w:t xml:space="preserve">Founder, </w:t>
+      </w:r>
+      <w:r>
+        <w:rPr>
+          <w:rFonts w:ascii="Calibri" w:cs="Calibri" w:eastAsia="Calibri" w:hAnsi="Calibri"/>
+          <w:b/>
+          <w:bCs/>
+          <w:color w:val="5B5B5B"/>
+          <w:sz w:val="22"/>
+          <w:szCs w:val="22"/>
+        </w:rPr>
+        <w:t xml:space="preserve">The</w:t>
+      </w:r>
+      <w:r>
+        <w:rPr>
+          <w:rFonts w:ascii="Calibri" w:cs="Calibri" w:eastAsia="Calibri" w:hAnsi="Calibri"/>
+          <w:b/>
+          <w:bCs/>
+          <w:color w:val="1F5F4A"/>
+          <w:sz w:val="22"/>
+          <w:szCs w:val="22"/>
+        </w:rPr>
+        <w:t xml:space="preserve">Interview</w:t>
+      </w:r>
+      <w:r>
+        <w:rPr>
+          <w:rFonts w:ascii="Calibri" w:cs="Calibri" w:eastAsia="Calibri" w:hAnsi="Calibri"/>
+          <w:b/>
+          <w:bCs/>
+          <w:color w:val="5B5B5B"/>
+          <w:sz w:val="22"/>
+          <w:szCs w:val="22"/>
+        </w:rPr>
+        <w:t xml:space="preserve">Chair</w:t>
+      </w:r>
+      <w:r>
+        <w:rPr>
+          <w:rFonts w:ascii="Calibri" w:cs="Calibri" w:eastAsia="Calibri" w:hAnsi="Calibri"/>
+          <w:color w:val="5B5B5B"/>
+          <w:sz w:val="22"/>
+          <w:szCs w:val="22"/>
+        </w:rPr>
+        <w:t xml:space="preserve">.com</w:t>
       </w:r>
     </w:p>
     <w:p>
@@ -223,7 +265,7 @@
           <w:sz w:val="24"/>
           <w:szCs w:val="24"/>
         </w:rPr>
-        <w:t xml:space="preserve">What We Have Already Built</w:t>
+        <w:t xml:space="preserve">The Loop</w:t>
       </w:r>
     </w:p>
     <w:p>
@@ -239,7 +281,7 @@
           <w:sz w:val="24"/>
           <w:szCs w:val="24"/>
         </w:rPr>
-        <w:t xml:space="preserve">Who Benefits</w:t>
+        <w:t xml:space="preserve">What We Have Already Built</w:t>
       </w:r>
     </w:p>
     <w:p>
@@ -255,7 +297,7 @@
           <w:sz w:val="24"/>
           <w:szCs w:val="24"/>
         </w:rPr>
-        <w:t xml:space="preserve">Business Model &amp; Pricing</w:t>
+        <w:t xml:space="preserve">Who Benefits</w:t>
       </w:r>
     </w:p>
     <w:p>
@@ -271,7 +313,7 @@
           <w:sz w:val="24"/>
           <w:szCs w:val="24"/>
         </w:rPr>
-        <w:t xml:space="preserve">Unit Economics</w:t>
+        <w:t xml:space="preserve">Business Model &amp; Pricing</w:t>
       </w:r>
     </w:p>
     <w:p>
@@ -287,7 +329,7 @@
           <w:sz w:val="24"/>
           <w:szCs w:val="24"/>
         </w:rPr>
-        <w:t xml:space="preserve">How We Reach Them</w:t>
+        <w:t xml:space="preserve">Unit Economics</w:t>
       </w:r>
     </w:p>
     <w:p>
@@ -303,7 +345,7 @@
           <w:sz w:val="24"/>
           <w:szCs w:val="24"/>
         </w:rPr>
-        <w:t xml:space="preserve">Risks</w:t>
+        <w:t xml:space="preserve">How We Reach Them</w:t>
       </w:r>
     </w:p>
     <w:p>
@@ -319,7 +361,7 @@
           <w:sz w:val="24"/>
           <w:szCs w:val="24"/>
         </w:rPr>
-        <w:t xml:space="preserve">The Ask</w:t>
+        <w:t xml:space="preserve">Risks</w:t>
       </w:r>
     </w:p>
     <w:p>
@@ -335,6 +377,38 @@
           <w:sz w:val="24"/>
           <w:szCs w:val="24"/>
         </w:rPr>
+        <w:t xml:space="preserve">The Ask</w:t>
+      </w:r>
+    </w:p>
+    <w:p>
+      <w:pPr>
+        <w:spacing w:after="140"/>
+      </w:pPr>
+      <w:r>
+        <w:rPr>
+          <w:rFonts w:ascii="Calibri" w:cs="Calibri" w:eastAsia="Calibri" w:hAnsi="Calibri"/>
+          <w:b/>
+          <w:bCs/>
+          <w:color w:val="1F5F4A"/>
+          <w:sz w:val="24"/>
+          <w:szCs w:val="24"/>
+        </w:rPr>
+        <w:t xml:space="preserve">The Wider Platform</w:t>
+      </w:r>
+    </w:p>
+    <w:p>
+      <w:pPr>
+        <w:spacing w:after="140"/>
+      </w:pPr>
+      <w:r>
+        <w:rPr>
+          <w:rFonts w:ascii="Calibri" w:cs="Calibri" w:eastAsia="Calibri" w:hAnsi="Calibri"/>
+          <w:b/>
+          <w:bCs/>
+          <w:color w:val="1F5F4A"/>
+          <w:sz w:val="24"/>
+          <w:szCs w:val="24"/>
+        </w:rPr>
         <w:t xml:space="preserve">Closing</w:t>
       </w:r>
     </w:p>
@@ -359,11 +433,53 @@
       <w:r>
         <w:rPr>
           <w:rFonts w:ascii="Calibri" w:cs="Calibri" w:eastAsia="Calibri" w:hAnsi="Calibri"/>
-          <w:color w:val="1A1A1A"/>
-          <w:sz w:val="22"/>
-          <w:szCs w:val="22"/>
-        </w:rPr>
-        <w:t xml:space="preserve">TheInterviewChair.com is a working, live platform that lets anyone practise a real job interview with an AI interviewer — speaking, listening, and scoring the answer honestly across five dimensions — and walk away with a genuine, defensible sense of where they stand. It already runs in production today: real candidates, real recruiters, real payments, no prototype or mock-up involved.</w:t>
+          <w:b/>
+          <w:bCs/>
+          <w:color w:val="1A1A1A"/>
+          <w:sz w:val="22"/>
+          <w:szCs w:val="22"/>
+        </w:rPr>
+        <w:t xml:space="preserve">The</w:t>
+      </w:r>
+      <w:r>
+        <w:rPr>
+          <w:rFonts w:ascii="Calibri" w:cs="Calibri" w:eastAsia="Calibri" w:hAnsi="Calibri"/>
+          <w:b/>
+          <w:bCs/>
+          <w:color w:val="1F5F4A"/>
+          <w:sz w:val="22"/>
+          <w:szCs w:val="22"/>
+        </w:rPr>
+        <w:t xml:space="preserve">Interview</w:t>
+      </w:r>
+      <w:r>
+        <w:rPr>
+          <w:rFonts w:ascii="Calibri" w:cs="Calibri" w:eastAsia="Calibri" w:hAnsi="Calibri"/>
+          <w:b/>
+          <w:bCs/>
+          <w:color w:val="1A1A1A"/>
+          <w:sz w:val="22"/>
+          <w:szCs w:val="22"/>
+        </w:rPr>
+        <w:t xml:space="preserve">Chair</w:t>
+      </w:r>
+      <w:r>
+        <w:rPr>
+          <w:rFonts w:ascii="Calibri" w:cs="Calibri" w:eastAsia="Calibri" w:hAnsi="Calibri"/>
+          <w:color w:val="5B5B5B"/>
+          <w:sz w:val="22"/>
+          <w:szCs w:val="22"/>
+        </w:rPr>
+        <w:t xml:space="preserve">.com</w:t>
+      </w:r>
+      <w:r>
+        <w:rPr>
+          <w:rFonts w:ascii="Calibri" w:cs="Calibri" w:eastAsia="Calibri" w:hAnsi="Calibri"/>
+          <w:color w:val="1A1A1A"/>
+          <w:sz w:val="22"/>
+          <w:szCs w:val="22"/>
+        </w:rPr>
+        <w:t xml:space="preserve"> is a working, live platform that lets anyone practise a real job interview with an AI interviewer — speaking, listening, and scoring the answer honestly across five dimensions — and walk away with a genuine, defensible sense of where they stand. It already runs in production today: real candidates, real recruiters, real payments, no prototype or mock-up involved.</w:t>
       </w:r>
     </w:p>
     <w:p>
@@ -456,11 +572,53 @@
       <w:r>
         <w:rPr>
           <w:rFonts w:ascii="Calibri" w:cs="Calibri" w:eastAsia="Calibri" w:hAnsi="Calibri"/>
-          <w:color w:val="1A1A1A"/>
-          <w:sz w:val="22"/>
-          <w:szCs w:val="22"/>
-        </w:rPr>
-        <w:t xml:space="preserve">TheInterviewChair.com exists to put a genuinely rigorous, honest interviewer within reach of anyone, for the cost of a coffee rather than a career coach.</w:t>
+          <w:b/>
+          <w:bCs/>
+          <w:color w:val="1A1A1A"/>
+          <w:sz w:val="22"/>
+          <w:szCs w:val="22"/>
+        </w:rPr>
+        <w:t xml:space="preserve">The</w:t>
+      </w:r>
+      <w:r>
+        <w:rPr>
+          <w:rFonts w:ascii="Calibri" w:cs="Calibri" w:eastAsia="Calibri" w:hAnsi="Calibri"/>
+          <w:b/>
+          <w:bCs/>
+          <w:color w:val="1F5F4A"/>
+          <w:sz w:val="22"/>
+          <w:szCs w:val="22"/>
+        </w:rPr>
+        <w:t xml:space="preserve">Interview</w:t>
+      </w:r>
+      <w:r>
+        <w:rPr>
+          <w:rFonts w:ascii="Calibri" w:cs="Calibri" w:eastAsia="Calibri" w:hAnsi="Calibri"/>
+          <w:b/>
+          <w:bCs/>
+          <w:color w:val="1A1A1A"/>
+          <w:sz w:val="22"/>
+          <w:szCs w:val="22"/>
+        </w:rPr>
+        <w:t xml:space="preserve">Chair</w:t>
+      </w:r>
+      <w:r>
+        <w:rPr>
+          <w:rFonts w:ascii="Calibri" w:cs="Calibri" w:eastAsia="Calibri" w:hAnsi="Calibri"/>
+          <w:color w:val="5B5B5B"/>
+          <w:sz w:val="22"/>
+          <w:szCs w:val="22"/>
+        </w:rPr>
+        <w:t xml:space="preserve">.com</w:t>
+      </w:r>
+      <w:r>
+        <w:rPr>
+          <w:rFonts w:ascii="Calibri" w:cs="Calibri" w:eastAsia="Calibri" w:hAnsi="Calibri"/>
+          <w:color w:val="1A1A1A"/>
+          <w:sz w:val="22"/>
+          <w:szCs w:val="22"/>
+        </w:rPr>
+        <w:t xml:space="preserve"> exists to put a genuinely rigorous, honest interviewer within reach of anyone, for the cost of a coffee rather than a career coach.</w:t>
       </w:r>
     </w:p>
     <w:p>
@@ -479,11 +637,53 @@
       <w:r>
         <w:rPr>
           <w:rFonts w:ascii="Calibri" w:cs="Calibri" w:eastAsia="Calibri" w:hAnsi="Calibri"/>
-          <w:color w:val="1A1A1A"/>
-          <w:sz w:val="22"/>
-          <w:szCs w:val="22"/>
-        </w:rPr>
-        <w:t xml:space="preserve">TheInterviewChair.com was designed and built from a dialysis chair — three sessions a week, four hours at a time, in the hours a serious kidney condition leaves free. That constraint has shaped the product directly: it forces absolute clarity about what actually matters, and it means every feature in this plan has been built and shipped personally by its founder, not commissioned or outsourced.</w:t>
+          <w:b/>
+          <w:bCs/>
+          <w:color w:val="1A1A1A"/>
+          <w:sz w:val="22"/>
+          <w:szCs w:val="22"/>
+        </w:rPr>
+        <w:t xml:space="preserve">The</w:t>
+      </w:r>
+      <w:r>
+        <w:rPr>
+          <w:rFonts w:ascii="Calibri" w:cs="Calibri" w:eastAsia="Calibri" w:hAnsi="Calibri"/>
+          <w:b/>
+          <w:bCs/>
+          <w:color w:val="1F5F4A"/>
+          <w:sz w:val="22"/>
+          <w:szCs w:val="22"/>
+        </w:rPr>
+        <w:t xml:space="preserve">Interview</w:t>
+      </w:r>
+      <w:r>
+        <w:rPr>
+          <w:rFonts w:ascii="Calibri" w:cs="Calibri" w:eastAsia="Calibri" w:hAnsi="Calibri"/>
+          <w:b/>
+          <w:bCs/>
+          <w:color w:val="1A1A1A"/>
+          <w:sz w:val="22"/>
+          <w:szCs w:val="22"/>
+        </w:rPr>
+        <w:t xml:space="preserve">Chair</w:t>
+      </w:r>
+      <w:r>
+        <w:rPr>
+          <w:rFonts w:ascii="Calibri" w:cs="Calibri" w:eastAsia="Calibri" w:hAnsi="Calibri"/>
+          <w:color w:val="5B5B5B"/>
+          <w:sz w:val="22"/>
+          <w:szCs w:val="22"/>
+        </w:rPr>
+        <w:t xml:space="preserve">.com</w:t>
+      </w:r>
+      <w:r>
+        <w:rPr>
+          <w:rFonts w:ascii="Calibri" w:cs="Calibri" w:eastAsia="Calibri" w:hAnsi="Calibri"/>
+          <w:color w:val="1A1A1A"/>
+          <w:sz w:val="22"/>
+          <w:szCs w:val="22"/>
+        </w:rPr>
+        <w:t xml:space="preserve"> was designed and built from a dialysis chair — three sessions a week, four hours at a time, in the hours a serious kidney condition leaves free. That constraint has shaped the product directly: it forces absolute clarity about what actually matters, and it means every feature in this plan has been built and shipped personally by its founder, not commissioned or outsourced.</w:t>
       </w:r>
     </w:p>
     <w:p>
@@ -511,7 +711,58 @@
           <w:sz w:val="22"/>
           <w:szCs w:val="22"/>
         </w:rPr>
-        <w:t xml:space="preserve">That personal history also produced the product’s central insight, discovered after twenty-five years of searching for how learning actually sticks: knowledge becomes truly owned not by reading or repetition, but by being interrogated on it — questioned, followed up, pushed to go deeper, and told honestly where it falls short. The interview format itself, it turns out, is one of the most powerful learning tools that exists. TheInterviewChair.com is built on that discovery.</w:t>
+        <w:t xml:space="preserve">That personal history also produced the product’s central insight, discovered after twenty-five years of searching for how learning actually sticks: knowledge becomes truly owned not by reading or repetition, but by being interrogated on it — questioned, followed up, pushed to go deeper, and told honestly where it falls short. The interview format itself, it turns out, is one of the most powerful learning tools that exists. </w:t>
+      </w:r>
+      <w:r>
+        <w:rPr>
+          <w:rFonts w:ascii="Calibri" w:cs="Calibri" w:eastAsia="Calibri" w:hAnsi="Calibri"/>
+          <w:b/>
+          <w:bCs/>
+          <w:color w:val="1A1A1A"/>
+          <w:sz w:val="22"/>
+          <w:szCs w:val="22"/>
+        </w:rPr>
+        <w:t xml:space="preserve">The</w:t>
+      </w:r>
+      <w:r>
+        <w:rPr>
+          <w:rFonts w:ascii="Calibri" w:cs="Calibri" w:eastAsia="Calibri" w:hAnsi="Calibri"/>
+          <w:b/>
+          <w:bCs/>
+          <w:color w:val="1F5F4A"/>
+          <w:sz w:val="22"/>
+          <w:szCs w:val="22"/>
+        </w:rPr>
+        <w:t xml:space="preserve">Interview</w:t>
+      </w:r>
+      <w:r>
+        <w:rPr>
+          <w:rFonts w:ascii="Calibri" w:cs="Calibri" w:eastAsia="Calibri" w:hAnsi="Calibri"/>
+          <w:b/>
+          <w:bCs/>
+          <w:color w:val="1A1A1A"/>
+          <w:sz w:val="22"/>
+          <w:szCs w:val="22"/>
+        </w:rPr>
+        <w:t xml:space="preserve">Chair</w:t>
+      </w:r>
+      <w:r>
+        <w:rPr>
+          <w:rFonts w:ascii="Calibri" w:cs="Calibri" w:eastAsia="Calibri" w:hAnsi="Calibri"/>
+          <w:color w:val="5B5B5B"/>
+          <w:sz w:val="22"/>
+          <w:szCs w:val="22"/>
+        </w:rPr>
+        <w:t xml:space="preserve">.com</w:t>
+      </w:r>
+      <w:r>
+        <w:rPr>
+          <w:rFonts w:ascii="Calibri" w:cs="Calibri" w:eastAsia="Calibri" w:hAnsi="Calibri"/>
+          <w:color w:val="1A1A1A"/>
+          <w:sz w:val="22"/>
+          <w:szCs w:val="22"/>
+        </w:rPr>
+        <w:t xml:space="preserve"> is built on that discovery.</w:t>
       </w:r>
     </w:p>
     <w:p>
@@ -520,7 +771,23 @@
         <w:spacing w:after="200" w:before="480"/>
       </w:pPr>
       <w:r>
-        <w:t xml:space="preserve">What We Have Already Built</w:t>
+        <w:t xml:space="preserve">The Loop</w:t>
+      </w:r>
+    </w:p>
+    <w:p>
+      <w:pPr>
+        <w:spacing w:after="220" w:line="320"/>
+      </w:pPr>
+      <w:r>
+        <w:rPr>
+          <w:rFonts w:ascii="Calibri" w:cs="Calibri" w:eastAsia="Calibri" w:hAnsi="Calibri"/>
+          <w:i/>
+          <w:iCs/>
+          <w:color w:val="1F5F4A"/>
+          <w:sz w:val="23"/>
+          <w:szCs w:val="23"/>
+        </w:rPr>
+        <w:t xml:space="preserve">Practice. Get scored. Close the exact gap. Practice again.</w:t>
       </w:r>
     </w:p>
     <w:p>
@@ -534,7 +801,58 @@
           <w:sz w:val="22"/>
           <w:szCs w:val="22"/>
         </w:rPr>
-        <w:t xml:space="preserve">This is not a concept awaiting funding to begin — it is a live, working product with real infrastructure behind it:</w:t>
+        <w:t xml:space="preserve">That twenty-five-year discovery is not just the story behind </w:t>
+      </w:r>
+      <w:r>
+        <w:rPr>
+          <w:rFonts w:ascii="Calibri" w:cs="Calibri" w:eastAsia="Calibri" w:hAnsi="Calibri"/>
+          <w:b/>
+          <w:bCs/>
+          <w:color w:val="1A1A1A"/>
+          <w:sz w:val="22"/>
+          <w:szCs w:val="22"/>
+        </w:rPr>
+        <w:t xml:space="preserve">The</w:t>
+      </w:r>
+      <w:r>
+        <w:rPr>
+          <w:rFonts w:ascii="Calibri" w:cs="Calibri" w:eastAsia="Calibri" w:hAnsi="Calibri"/>
+          <w:b/>
+          <w:bCs/>
+          <w:color w:val="1F5F4A"/>
+          <w:sz w:val="22"/>
+          <w:szCs w:val="22"/>
+        </w:rPr>
+        <w:t xml:space="preserve">Interview</w:t>
+      </w:r>
+      <w:r>
+        <w:rPr>
+          <w:rFonts w:ascii="Calibri" w:cs="Calibri" w:eastAsia="Calibri" w:hAnsi="Calibri"/>
+          <w:b/>
+          <w:bCs/>
+          <w:color w:val="1A1A1A"/>
+          <w:sz w:val="22"/>
+          <w:szCs w:val="22"/>
+        </w:rPr>
+        <w:t xml:space="preserve">Chair</w:t>
+      </w:r>
+      <w:r>
+        <w:rPr>
+          <w:rFonts w:ascii="Calibri" w:cs="Calibri" w:eastAsia="Calibri" w:hAnsi="Calibri"/>
+          <w:color w:val="5B5B5B"/>
+          <w:sz w:val="22"/>
+          <w:szCs w:val="22"/>
+        </w:rPr>
+        <w:t xml:space="preserve">.com</w:t>
+      </w:r>
+      <w:r>
+        <w:rPr>
+          <w:rFonts w:ascii="Calibri" w:cs="Calibri" w:eastAsia="Calibri" w:hAnsi="Calibri"/>
+          <w:color w:val="1A1A1A"/>
+          <w:sz w:val="22"/>
+          <w:szCs w:val="22"/>
+        </w:rPr>
+        <w:t xml:space="preserve"> — it is built directly into the product as a real, working mechanism, not a slogan. It runs automatically, every time:</w:t>
       </w:r>
     </w:p>
     <w:p>
@@ -553,7 +871,7 @@
           <w:sz w:val="22"/>
           <w:szCs w:val="22"/>
         </w:rPr>
-        <w:t xml:space="preserve">Live, spoken AI interviewers (Amina and Wayne) conducting real-time interviews across 32 languages, with genuine follow-up questioning, not a scripted question bank.</w:t>
+        <w:t xml:space="preserve">Interview — a real, spoken interview for the exact role the candidate names, not a generic question bank.</w:t>
       </w:r>
     </w:p>
     <w:p>
@@ -572,7 +890,7 @@
           <w:sz w:val="22"/>
           <w:szCs w:val="22"/>
         </w:rPr>
-        <w:t xml:space="preserve">Transparent, published scoring across five dimensions — Relevance, Accuracy, Clarity, Depth, Confidence — plus a bonus knowledge round and character questions, with the full method public on the site’s own “How We Score” page.</w:t>
+        <w:t xml:space="preserve">Scored, honestly — a dimension-by-dimension result that shows exactly where the gap is, not just a single number to feel good or bad about.</w:t>
       </w:r>
     </w:p>
     <w:p>
@@ -591,7 +909,7 @@
           <w:sz w:val="22"/>
           <w:szCs w:val="22"/>
         </w:rPr>
-        <w:t xml:space="preserve">A Pass / Keep-on-file / Fail verdict and a shareable, downloadable certificate on a genuine pass.</w:t>
+        <w:t xml:space="preserve">Learn — the platform routes the candidate straight into a short lesson built around their single weakest topic from that interview, closing the specific gap that was just exposed, not a generic study plan.</w:t>
       </w:r>
     </w:p>
     <w:p>
@@ -610,7 +928,44 @@
           <w:sz w:val="22"/>
           <w:szCs w:val="22"/>
         </w:rPr>
-        <w:t xml:space="preserve">A working recruiter portal — candidate search, talent alerts, interview recordings, and a one-click “send an interview-prep link” flow already used by a real client.</w:t>
+        <w:t xml:space="preserve">Interview again — armed with what they just learned, they return and prove it under real pressure, the same act of interrogation that the founder’s own research found is what actually makes knowledge stick.</w:t>
+      </w:r>
+    </w:p>
+    <w:p>
+      <w:pPr>
+        <w:spacing w:after="160" w:line="300"/>
+      </w:pPr>
+      <w:r>
+        <w:rPr>
+          <w:rFonts w:ascii="Calibri" w:cs="Calibri" w:eastAsia="Calibri" w:hAnsi="Calibri"/>
+          <w:color w:val="1A1A1A"/>
+          <w:sz w:val="22"/>
+          <w:szCs w:val="22"/>
+        </w:rPr>
+        <w:t xml:space="preserve">This is the platform’s most distinctive mechanism, and the clearest expression of the effort that has gone into making it genuinely useful rather than merely impressive: most tools either test a candidate or teach a candidate. Very few do both, and fewer still point automatically from one straight into the other. The Loop is that connection, built in from the start.</w:t>
+      </w:r>
+    </w:p>
+    <w:p>
+      <w:pPr>
+        <w:pStyle w:val="Heading1"/>
+        <w:spacing w:after="200" w:before="480"/>
+      </w:pPr>
+      <w:r>
+        <w:t xml:space="preserve">What We Have Already Built</w:t>
+      </w:r>
+    </w:p>
+    <w:p>
+      <w:pPr>
+        <w:spacing w:after="160" w:line="300"/>
+      </w:pPr>
+      <w:r>
+        <w:rPr>
+          <w:rFonts w:ascii="Calibri" w:cs="Calibri" w:eastAsia="Calibri" w:hAnsi="Calibri"/>
+          <w:color w:val="1A1A1A"/>
+          <w:sz w:val="22"/>
+          <w:szCs w:val="22"/>
+        </w:rPr>
+        <w:t xml:space="preserve">This is not a concept awaiting funding to begin — it is a live, working product with real infrastructure behind it:</w:t>
       </w:r>
     </w:p>
     <w:p>
@@ -618,7 +973,7 @@
         <w:pStyle w:val="ListParagraph"/>
         <w:numPr>
           <w:ilvl w:val="0"/>
-          <w:numId w:val="2"/>
+          <w:numId w:val="3"/>
         </w:numPr>
         <w:spacing w:after="100" w:line="280"/>
       </w:pPr>
@@ -629,7 +984,7 @@
           <w:sz w:val="22"/>
           <w:szCs w:val="22"/>
         </w:rPr>
-        <w:t xml:space="preserve">Live, processed payments (Stripe) for candidate subscriptions, one-off interview passes and recruiter seats — real money already moving through the system.</w:t>
+        <w:t xml:space="preserve">Live, spoken AI interviewers (Amina and Wayne) conducting real-time interviews across 32 languages, with genuine follow-up questioning, not a scripted question bank.</w:t>
       </w:r>
     </w:p>
     <w:p>
@@ -637,7 +992,7 @@
         <w:pStyle w:val="ListParagraph"/>
         <w:numPr>
           <w:ilvl w:val="0"/>
-          <w:numId w:val="2"/>
+          <w:numId w:val="3"/>
         </w:numPr>
         <w:spacing w:after="100" w:line="280"/>
       </w:pPr>
@@ -648,7 +1003,7 @@
           <w:sz w:val="22"/>
           <w:szCs w:val="22"/>
         </w:rPr>
-        <w:t xml:space="preserve">A free, no-account, three-question live demo (“Try it live”) built specifically to convert cold social-media traffic, including on phones.</w:t>
+        <w:t xml:space="preserve">Transparent, published scoring across five dimensions — Relevance, Accuracy, Clarity, Depth, Confidence — plus a bonus knowledge round and character questions, with the full method public on the site’s own “How We Score” page.</w:t>
       </w:r>
     </w:p>
     <w:p>
@@ -656,7 +1011,83 @@
         <w:pStyle w:val="ListParagraph"/>
         <w:numPr>
           <w:ilvl w:val="0"/>
-          <w:numId w:val="2"/>
+          <w:numId w:val="3"/>
+        </w:numPr>
+        <w:spacing w:after="100" w:line="280"/>
+      </w:pPr>
+      <w:r>
+        <w:rPr>
+          <w:rFonts w:ascii="Calibri" w:cs="Calibri" w:eastAsia="Calibri" w:hAnsi="Calibri"/>
+          <w:color w:val="1A1A1A"/>
+          <w:sz w:val="22"/>
+          <w:szCs w:val="22"/>
+        </w:rPr>
+        <w:t xml:space="preserve">A Pass / Keep-on-file / Fail verdict and a shareable, downloadable certificate on a genuine pass.</w:t>
+      </w:r>
+    </w:p>
+    <w:p>
+      <w:pPr>
+        <w:pStyle w:val="ListParagraph"/>
+        <w:numPr>
+          <w:ilvl w:val="0"/>
+          <w:numId w:val="3"/>
+        </w:numPr>
+        <w:spacing w:after="100" w:line="280"/>
+      </w:pPr>
+      <w:r>
+        <w:rPr>
+          <w:rFonts w:ascii="Calibri" w:cs="Calibri" w:eastAsia="Calibri" w:hAnsi="Calibri"/>
+          <w:color w:val="1A1A1A"/>
+          <w:sz w:val="22"/>
+          <w:szCs w:val="22"/>
+        </w:rPr>
+        <w:t xml:space="preserve">A working recruiter portal — candidate search, talent alerts, interview recordings, and a one-click “send an interview-prep link” flow already used by a real client.</w:t>
+      </w:r>
+    </w:p>
+    <w:p>
+      <w:pPr>
+        <w:pStyle w:val="ListParagraph"/>
+        <w:numPr>
+          <w:ilvl w:val="0"/>
+          <w:numId w:val="3"/>
+        </w:numPr>
+        <w:spacing w:after="100" w:line="280"/>
+      </w:pPr>
+      <w:r>
+        <w:rPr>
+          <w:rFonts w:ascii="Calibri" w:cs="Calibri" w:eastAsia="Calibri" w:hAnsi="Calibri"/>
+          <w:color w:val="1A1A1A"/>
+          <w:sz w:val="22"/>
+          <w:szCs w:val="22"/>
+        </w:rPr>
+        <w:t xml:space="preserve">Live, processed payments (Stripe) for candidate subscriptions, one-off interview passes and recruiter seats — real money already moving through the system.</w:t>
+      </w:r>
+    </w:p>
+    <w:p>
+      <w:pPr>
+        <w:pStyle w:val="ListParagraph"/>
+        <w:numPr>
+          <w:ilvl w:val="0"/>
+          <w:numId w:val="3"/>
+        </w:numPr>
+        <w:spacing w:after="100" w:line="280"/>
+      </w:pPr>
+      <w:r>
+        <w:rPr>
+          <w:rFonts w:ascii="Calibri" w:cs="Calibri" w:eastAsia="Calibri" w:hAnsi="Calibri"/>
+          <w:color w:val="1A1A1A"/>
+          <w:sz w:val="22"/>
+          <w:szCs w:val="22"/>
+        </w:rPr>
+        <w:t xml:space="preserve">A free, no-account, three-question live demo (“Try it live”) built specifically to convert cold social-media traffic, including on phones.</w:t>
+      </w:r>
+    </w:p>
+    <w:p>
+      <w:pPr>
+        <w:pStyle w:val="ListParagraph"/>
+        <w:numPr>
+          <w:ilvl w:val="0"/>
+          <w:numId w:val="3"/>
         </w:numPr>
         <w:spacing w:after="100" w:line="280"/>
       </w:pPr>
@@ -838,7 +1269,7 @@
         <w:pStyle w:val="ListParagraph"/>
         <w:numPr>
           <w:ilvl w:val="0"/>
-          <w:numId w:val="2"/>
+          <w:numId w:val="3"/>
         </w:numPr>
         <w:spacing w:after="100" w:line="280"/>
       </w:pPr>
@@ -857,7 +1288,7 @@
         <w:pStyle w:val="ListParagraph"/>
         <w:numPr>
           <w:ilvl w:val="0"/>
-          <w:numId w:val="2"/>
+          <w:numId w:val="3"/>
         </w:numPr>
         <w:spacing w:after="100" w:line="280"/>
       </w:pPr>
@@ -876,7 +1307,7 @@
         <w:pStyle w:val="ListParagraph"/>
         <w:numPr>
           <w:ilvl w:val="0"/>
-          <w:numId w:val="2"/>
+          <w:numId w:val="3"/>
         </w:numPr>
         <w:spacing w:after="100" w:line="280"/>
       </w:pPr>
@@ -895,7 +1326,7 @@
         <w:pStyle w:val="ListParagraph"/>
         <w:numPr>
           <w:ilvl w:val="0"/>
-          <w:numId w:val="2"/>
+          <w:numId w:val="3"/>
         </w:numPr>
         <w:spacing w:after="100" w:line="280"/>
       </w:pPr>
@@ -914,7 +1345,7 @@
         <w:pStyle w:val="ListParagraph"/>
         <w:numPr>
           <w:ilvl w:val="0"/>
-          <w:numId w:val="2"/>
+          <w:numId w:val="3"/>
         </w:numPr>
         <w:spacing w:after="100" w:line="280"/>
       </w:pPr>
@@ -1753,7 +2184,7 @@
         <w:pStyle w:val="ListParagraph"/>
         <w:numPr>
           <w:ilvl w:val="0"/>
-          <w:numId w:val="2"/>
+          <w:numId w:val="3"/>
         </w:numPr>
         <w:spacing w:after="100" w:line="280"/>
       </w:pPr>
@@ -1772,7 +2203,7 @@
         <w:pStyle w:val="ListParagraph"/>
         <w:numPr>
           <w:ilvl w:val="0"/>
-          <w:numId w:val="2"/>
+          <w:numId w:val="3"/>
         </w:numPr>
         <w:spacing w:after="100" w:line="280"/>
       </w:pPr>
@@ -2689,7 +3120,7 @@
         <w:pStyle w:val="ListParagraph"/>
         <w:numPr>
           <w:ilvl w:val="0"/>
-          <w:numId w:val="2"/>
+          <w:numId w:val="3"/>
         </w:numPr>
         <w:spacing w:after="100" w:line="280"/>
       </w:pPr>
@@ -2708,7 +3139,7 @@
         <w:pStyle w:val="ListParagraph"/>
         <w:numPr>
           <w:ilvl w:val="0"/>
-          <w:numId w:val="2"/>
+          <w:numId w:val="3"/>
         </w:numPr>
         <w:spacing w:after="100" w:line="280"/>
       </w:pPr>
@@ -2727,7 +3158,7 @@
         <w:pStyle w:val="ListParagraph"/>
         <w:numPr>
           <w:ilvl w:val="0"/>
-          <w:numId w:val="2"/>
+          <w:numId w:val="3"/>
         </w:numPr>
         <w:spacing w:after="100" w:line="280"/>
       </w:pPr>
@@ -2746,7 +3177,7 @@
         <w:pStyle w:val="ListParagraph"/>
         <w:numPr>
           <w:ilvl w:val="0"/>
-          <w:numId w:val="2"/>
+          <w:numId w:val="3"/>
         </w:numPr>
         <w:spacing w:after="100" w:line="280"/>
       </w:pPr>
@@ -3411,7 +3842,7 @@
         <w:pStyle w:val="ListParagraph"/>
         <w:numPr>
           <w:ilvl w:val="0"/>
-          <w:numId w:val="2"/>
+          <w:numId w:val="3"/>
         </w:numPr>
         <w:spacing w:after="100" w:line="280"/>
       </w:pPr>
@@ -3430,7 +3861,7 @@
         <w:pStyle w:val="ListParagraph"/>
         <w:numPr>
           <w:ilvl w:val="0"/>
-          <w:numId w:val="2"/>
+          <w:numId w:val="3"/>
         </w:numPr>
         <w:spacing w:after="100" w:line="280"/>
       </w:pPr>
@@ -3449,7 +3880,7 @@
         <w:pStyle w:val="ListParagraph"/>
         <w:numPr>
           <w:ilvl w:val="0"/>
-          <w:numId w:val="2"/>
+          <w:numId w:val="3"/>
         </w:numPr>
         <w:spacing w:after="100" w:line="280"/>
       </w:pPr>
@@ -3483,6 +3914,249 @@
         <w:spacing w:after="200" w:before="480"/>
       </w:pPr>
       <w:r>
+        <w:t xml:space="preserve">The Wider Platform</w:t>
+      </w:r>
+    </w:p>
+    <w:p>
+      <w:pPr>
+        <w:spacing w:after="160" w:line="300"/>
+      </w:pPr>
+      <w:r>
+        <w:rPr>
+          <w:rFonts w:ascii="Calibri" w:cs="Calibri" w:eastAsia="Calibri" w:hAnsi="Calibri"/>
+          <w:color w:val="1A1A1A"/>
+          <w:sz w:val="22"/>
+          <w:szCs w:val="22"/>
+        </w:rPr>
+        <w:t xml:space="preserve">Everything above is deliberately built around the interview itself, because that is where the business case is clearest. But the interview is one part of a considerably larger platform already live today — worth setting out in full, since it is easy to under-sell a product this complete by only ever talking about its headline feature:</w:t>
+      </w:r>
+    </w:p>
+    <w:p>
+      <w:pPr>
+        <w:pStyle w:val="ListParagraph"/>
+        <w:numPr>
+          <w:ilvl w:val="0"/>
+          <w:numId w:val="3"/>
+        </w:numPr>
+        <w:spacing w:after="100" w:line="280"/>
+      </w:pPr>
+      <w:r>
+        <w:rPr>
+          <w:rFonts w:ascii="Calibri" w:cs="Calibri" w:eastAsia="Calibri" w:hAnsi="Calibri"/>
+          <w:color w:val="1A1A1A"/>
+          <w:sz w:val="22"/>
+          <w:szCs w:val="22"/>
+        </w:rPr>
+        <w:t xml:space="preserve">AI Career Coach — a conversational coach candidates can talk through their career direction and choices with, on demand.</w:t>
+      </w:r>
+    </w:p>
+    <w:p>
+      <w:pPr>
+        <w:pStyle w:val="ListParagraph"/>
+        <w:numPr>
+          <w:ilvl w:val="0"/>
+          <w:numId w:val="3"/>
+        </w:numPr>
+        <w:spacing w:after="100" w:line="280"/>
+      </w:pPr>
+      <w:r>
+        <w:rPr>
+          <w:rFonts w:ascii="Calibri" w:cs="Calibri" w:eastAsia="Calibri" w:hAnsi="Calibri"/>
+          <w:color w:val="1A1A1A"/>
+          <w:sz w:val="22"/>
+          <w:szCs w:val="22"/>
+        </w:rPr>
+        <w:t xml:space="preserve">Careers Explorer — browse real careers, what they actually pay, and what they require, in plain language.</w:t>
+      </w:r>
+    </w:p>
+    <w:p>
+      <w:pPr>
+        <w:pStyle w:val="ListParagraph"/>
+        <w:numPr>
+          <w:ilvl w:val="0"/>
+          <w:numId w:val="3"/>
+        </w:numPr>
+        <w:spacing w:after="100" w:line="280"/>
+      </w:pPr>
+      <w:r>
+        <w:rPr>
+          <w:rFonts w:ascii="Calibri" w:cs="Calibri" w:eastAsia="Calibri" w:hAnsi="Calibri"/>
+          <w:color w:val="1A1A1A"/>
+          <w:sz w:val="22"/>
+          <w:szCs w:val="22"/>
+        </w:rPr>
+        <w:t xml:space="preserve">Talk Practice — practise a spoken presentation with live feedback, with a browsable library of public talks from other users.</w:t>
+      </w:r>
+    </w:p>
+    <w:p>
+      <w:pPr>
+        <w:pStyle w:val="ListParagraph"/>
+        <w:numPr>
+          <w:ilvl w:val="0"/>
+          <w:numId w:val="3"/>
+        </w:numPr>
+        <w:spacing w:after="100" w:line="280"/>
+      </w:pPr>
+      <w:r>
+        <w:rPr>
+          <w:rFonts w:ascii="Calibri" w:cs="Calibri" w:eastAsia="Calibri" w:hAnsi="Calibri"/>
+          <w:color w:val="1A1A1A"/>
+          <w:sz w:val="22"/>
+          <w:szCs w:val="22"/>
+        </w:rPr>
+        <w:t xml:space="preserve">Client Gifts — a recruiter gifts their hiring-manager client a genuinely useful set of free interview questions for a role, strengthening that relationship at zero cost.</w:t>
+      </w:r>
+    </w:p>
+    <w:p>
+      <w:pPr>
+        <w:pStyle w:val="ListParagraph"/>
+        <w:numPr>
+          <w:ilvl w:val="0"/>
+          <w:numId w:val="3"/>
+        </w:numPr>
+        <w:spacing w:after="100" w:line="280"/>
+      </w:pPr>
+      <w:r>
+        <w:rPr>
+          <w:rFonts w:ascii="Calibri" w:cs="Calibri" w:eastAsia="Calibri" w:hAnsi="Calibri"/>
+          <w:color w:val="1A1A1A"/>
+          <w:sz w:val="22"/>
+          <w:szCs w:val="22"/>
+        </w:rPr>
+        <w:t xml:space="preserve">Exams &amp; Certifications — 172 professional and school exam types, with scored mock papers; mock exams are free.</w:t>
+      </w:r>
+    </w:p>
+    <w:p>
+      <w:pPr>
+        <w:pStyle w:val="ListParagraph"/>
+        <w:numPr>
+          <w:ilvl w:val="0"/>
+          <w:numId w:val="3"/>
+        </w:numPr>
+        <w:spacing w:after="100" w:line="280"/>
+      </w:pPr>
+      <w:r>
+        <w:rPr>
+          <w:rFonts w:ascii="Calibri" w:cs="Calibri" w:eastAsia="Calibri" w:hAnsi="Calibri"/>
+          <w:color w:val="1A1A1A"/>
+          <w:sz w:val="22"/>
+          <w:szCs w:val="22"/>
+        </w:rPr>
+        <w:t xml:space="preserve">CV Analyser &amp; Salary Insights — upload a CV and see which roles genuinely fit, what they pay, and personal strengths and gaps, with a spoken walkthrough.</w:t>
+      </w:r>
+    </w:p>
+    <w:p>
+      <w:pPr>
+        <w:pStyle w:val="ListParagraph"/>
+        <w:numPr>
+          <w:ilvl w:val="0"/>
+          <w:numId w:val="3"/>
+        </w:numPr>
+        <w:spacing w:after="100" w:line="280"/>
+      </w:pPr>
+      <w:r>
+        <w:rPr>
+          <w:rFonts w:ascii="Calibri" w:cs="Calibri" w:eastAsia="Calibri" w:hAnsi="Calibri"/>
+          <w:color w:val="1A1A1A"/>
+          <w:sz w:val="22"/>
+          <w:szCs w:val="22"/>
+        </w:rPr>
+        <w:t xml:space="preserve">Interview Gifts — buy or send someone else a session pass as a genuinely useful gift.</w:t>
+      </w:r>
+    </w:p>
+    <w:p>
+      <w:pPr>
+        <w:pStyle w:val="ListParagraph"/>
+        <w:numPr>
+          <w:ilvl w:val="0"/>
+          <w:numId w:val="3"/>
+        </w:numPr>
+        <w:spacing w:after="100" w:line="280"/>
+      </w:pPr>
+      <w:r>
+        <w:rPr>
+          <w:rFonts w:ascii="Calibri" w:cs="Calibri" w:eastAsia="Calibri" w:hAnsi="Calibri"/>
+          <w:color w:val="1A1A1A"/>
+          <w:sz w:val="22"/>
+          <w:szCs w:val="22"/>
+        </w:rPr>
+        <w:t xml:space="preserve">Question Bank — save any model answer revealed during practice, to study again later.</w:t>
+      </w:r>
+    </w:p>
+    <w:p>
+      <w:pPr>
+        <w:pStyle w:val="ListParagraph"/>
+        <w:numPr>
+          <w:ilvl w:val="0"/>
+          <w:numId w:val="3"/>
+        </w:numPr>
+        <w:spacing w:after="100" w:line="280"/>
+      </w:pPr>
+      <w:r>
+        <w:rPr>
+          <w:rFonts w:ascii="Calibri" w:cs="Calibri" w:eastAsia="Calibri" w:hAnsi="Calibri"/>
+          <w:color w:val="1A1A1A"/>
+          <w:sz w:val="22"/>
+          <w:szCs w:val="22"/>
+        </w:rPr>
+        <w:t xml:space="preserve">Company-Specific Interviews — practise in the actual interview style of 68 named, real employers.</w:t>
+      </w:r>
+    </w:p>
+    <w:p>
+      <w:pPr>
+        <w:pStyle w:val="ListParagraph"/>
+        <w:numPr>
+          <w:ilvl w:val="0"/>
+          <w:numId w:val="3"/>
+        </w:numPr>
+        <w:spacing w:after="100" w:line="280"/>
+      </w:pPr>
+      <w:r>
+        <w:rPr>
+          <w:rFonts w:ascii="Calibri" w:cs="Calibri" w:eastAsia="Calibri" w:hAnsi="Calibri"/>
+          <w:color w:val="1A1A1A"/>
+          <w:sz w:val="22"/>
+          <w:szCs w:val="22"/>
+        </w:rPr>
+        <w:t xml:space="preserve">Learn Alerts — spaced-repetition practice questions delivered by email, so what was learned does not quietly fade.</w:t>
+      </w:r>
+    </w:p>
+    <w:p>
+      <w:pPr>
+        <w:spacing w:after="160" w:line="300"/>
+      </w:pPr>
+      <w:r>
+        <w:rPr>
+          <w:rFonts w:ascii="Calibri" w:cs="Calibri" w:eastAsia="Calibri" w:hAnsi="Calibri"/>
+          <w:color w:val="1A1A1A"/>
+          <w:sz w:val="22"/>
+          <w:szCs w:val="22"/>
+        </w:rPr>
+        <w:t xml:space="preserve">Coming next: the platform’s own jobs board — a natural extension once distribution (recruiters, candidates, and the Magic Button described above) is established, closing the loop from practising for a role to actually finding one.</w:t>
+      </w:r>
+    </w:p>
+    <w:p>
+      <w:pPr>
+        <w:spacing w:after="200" w:before="80" w:line="280"/>
+      </w:pPr>
+      <w:r>
+        <w:rPr>
+          <w:rFonts w:ascii="Calibri" w:cs="Calibri" w:eastAsia="Calibri" w:hAnsi="Calibri"/>
+          <w:i/>
+          <w:iCs/>
+          <w:color w:val="5B5B5B"/>
+          <w:sz w:val="20"/>
+          <w:szCs w:val="20"/>
+        </w:rPr>
+        <w:t xml:space="preserve">Screens illustrating each of the above can be added here once captured — most sit behind a candidate or recruiter login this plan’s preparation did not have access to.</w:t>
+      </w:r>
+    </w:p>
+    <w:p>
+      <w:pPr>
+        <w:pStyle w:val="Heading1"/>
+        <w:spacing w:after="200" w:before="480"/>
+      </w:pPr>
+      <w:r>
         <w:t xml:space="preserve">Closing</w:t>
       </w:r>
     </w:p>
@@ -3493,11 +4167,53 @@
       <w:r>
         <w:rPr>
           <w:rFonts w:ascii="Calibri" w:cs="Calibri" w:eastAsia="Calibri" w:hAnsi="Calibri"/>
-          <w:color w:val="1A1A1A"/>
-          <w:sz w:val="22"/>
-          <w:szCs w:val="22"/>
-        </w:rPr>
-        <w:t xml:space="preserve">TheInterviewChair.com already works. The technology is live, the early usage is real, and the cost to run it is proven and low relative to what it charges. What stands between today and meaningful scale is not the product — it is distribution, and this plan sets out, honestly and without inflating a single number, exactly how that gap gets closed.</w:t>
+          <w:b/>
+          <w:bCs/>
+          <w:color w:val="1A1A1A"/>
+          <w:sz w:val="22"/>
+          <w:szCs w:val="22"/>
+        </w:rPr>
+        <w:t xml:space="preserve">The</w:t>
+      </w:r>
+      <w:r>
+        <w:rPr>
+          <w:rFonts w:ascii="Calibri" w:cs="Calibri" w:eastAsia="Calibri" w:hAnsi="Calibri"/>
+          <w:b/>
+          <w:bCs/>
+          <w:color w:val="1F5F4A"/>
+          <w:sz w:val="22"/>
+          <w:szCs w:val="22"/>
+        </w:rPr>
+        <w:t xml:space="preserve">Interview</w:t>
+      </w:r>
+      <w:r>
+        <w:rPr>
+          <w:rFonts w:ascii="Calibri" w:cs="Calibri" w:eastAsia="Calibri" w:hAnsi="Calibri"/>
+          <w:b/>
+          <w:bCs/>
+          <w:color w:val="1A1A1A"/>
+          <w:sz w:val="22"/>
+          <w:szCs w:val="22"/>
+        </w:rPr>
+        <w:t xml:space="preserve">Chair</w:t>
+      </w:r>
+      <w:r>
+        <w:rPr>
+          <w:rFonts w:ascii="Calibri" w:cs="Calibri" w:eastAsia="Calibri" w:hAnsi="Calibri"/>
+          <w:color w:val="5B5B5B"/>
+          <w:sz w:val="22"/>
+          <w:szCs w:val="22"/>
+        </w:rPr>
+        <w:t xml:space="preserve">.com</w:t>
+      </w:r>
+      <w:r>
+        <w:rPr>
+          <w:rFonts w:ascii="Calibri" w:cs="Calibri" w:eastAsia="Calibri" w:hAnsi="Calibri"/>
+          <w:color w:val="1A1A1A"/>
+          <w:sz w:val="22"/>
+          <w:szCs w:val="22"/>
+        </w:rPr>
+        <w:t xml:space="preserve"> already works. The technology is live, the early usage is real, and the cost to run it is proven and low relative to what it charges. What stands between today and meaningful scale is not the product — it is distribution, and this plan sets out, honestly and without inflating a single number, exactly how that gap gets closed.</w:t>
       </w:r>
     </w:p>
     <w:sectPr>
@@ -3686,6 +4402,18 @@
       </w:pPr>
     </w:lvl>
   </w:abstractNum>
+  <w:abstractNum w:abstractNumId="3" w15:restartNumberingAfterBreak="0">
+    <w:multiLevelType w:val="hybridMultilevel"/>
+    <w:lvl w:ilvl="0" w15:tentative="1">
+      <w:start w:val="1"/>
+      <w:numFmt w:val="decimal"/>
+      <w:lvlText w:val="%1."/>
+      <w:lvlJc w:val="left"/>
+      <w:pPr>
+        <w:ind w:left="480" w:hanging="280"/>
+      </w:pPr>
+    </w:lvl>
+  </w:abstractNum>
   <w:num w:numId="1">
     <w:abstractNumId w:val="1"/>
     <w:lvlOverride w:ilvl="0">
@@ -3693,6 +4421,12 @@
     </w:lvlOverride>
   </w:num>
   <w:num w:numId="2">
+    <w:abstractNumId w:val="3"/>
+    <w:lvlOverride w:ilvl="0">
+      <w:startOverride w:val="1"/>
+    </w:lvlOverride>
+  </w:num>
+  <w:num w:numId="3">
     <w:abstractNumId w:val="2"/>
     <w:lvlOverride w:ilvl="0">
       <w:startOverride w:val="1"/>

</xml_diff>

<commit_message>
docs: expand each Wider Platform feature to a couple of descriptive lines
Co-Authored-By: Claude Sonnet 5 <noreply@anthropic.com>
</commit_message>
<xml_diff>
--- a/docs/business-plan/TheInterviewChair-Business-Plan.docx
+++ b/docs/business-plan/TheInterviewChair-Business-Plan.docx
@@ -3938,16 +3938,27 @@
           <w:ilvl w:val="0"/>
           <w:numId w:val="3"/>
         </w:numPr>
-        <w:spacing w:after="100" w:line="280"/>
-      </w:pPr>
-      <w:r>
-        <w:rPr>
-          <w:rFonts w:ascii="Calibri" w:cs="Calibri" w:eastAsia="Calibri" w:hAnsi="Calibri"/>
-          <w:color w:val="1A1A1A"/>
-          <w:sz w:val="22"/>
-          <w:szCs w:val="22"/>
-        </w:rPr>
-        <w:t xml:space="preserve">AI Career Coach — a conversational coach candidates can talk through their career direction and choices with, on demand.</w:t>
+        <w:spacing w:after="140" w:line="280"/>
+      </w:pPr>
+      <w:r>
+        <w:rPr>
+          <w:rFonts w:ascii="Calibri" w:cs="Calibri" w:eastAsia="Calibri" w:hAnsi="Calibri"/>
+          <w:b/>
+          <w:bCs/>
+          <w:color w:val="1A1A1A"/>
+          <w:sz w:val="22"/>
+          <w:szCs w:val="22"/>
+        </w:rPr>
+        <w:t xml:space="preserve">AI Career Coach</w:t>
+      </w:r>
+      <w:r>
+        <w:rPr>
+          <w:rFonts w:ascii="Calibri" w:cs="Calibri" w:eastAsia="Calibri" w:hAnsi="Calibri"/>
+          <w:color w:val="1A1A1A"/>
+          <w:sz w:val="22"/>
+          <w:szCs w:val="22"/>
+        </w:rPr>
+        <w:t xml:space="preserve"> — a conversational coach a candidate can talk through their career direction and choices with, on demand, not just interview preparation. Useful for someone who does not yet know what role to aim for, not only someone who already has an interview booked.</w:t>
       </w:r>
     </w:p>
     <w:p>
@@ -3957,16 +3968,27 @@
           <w:ilvl w:val="0"/>
           <w:numId w:val="3"/>
         </w:numPr>
-        <w:spacing w:after="100" w:line="280"/>
-      </w:pPr>
-      <w:r>
-        <w:rPr>
-          <w:rFonts w:ascii="Calibri" w:cs="Calibri" w:eastAsia="Calibri" w:hAnsi="Calibri"/>
-          <w:color w:val="1A1A1A"/>
-          <w:sz w:val="22"/>
-          <w:szCs w:val="22"/>
-        </w:rPr>
-        <w:t xml:space="preserve">Careers Explorer — browse real careers, what they actually pay, and what they require, in plain language.</w:t>
+        <w:spacing w:after="140" w:line="280"/>
+      </w:pPr>
+      <w:r>
+        <w:rPr>
+          <w:rFonts w:ascii="Calibri" w:cs="Calibri" w:eastAsia="Calibri" w:hAnsi="Calibri"/>
+          <w:b/>
+          <w:bCs/>
+          <w:color w:val="1A1A1A"/>
+          <w:sz w:val="22"/>
+          <w:szCs w:val="22"/>
+        </w:rPr>
+        <w:t xml:space="preserve">Careers Explorer</w:t>
+      </w:r>
+      <w:r>
+        <w:rPr>
+          <w:rFonts w:ascii="Calibri" w:cs="Calibri" w:eastAsia="Calibri" w:hAnsi="Calibri"/>
+          <w:color w:val="1A1A1A"/>
+          <w:sz w:val="22"/>
+          <w:szCs w:val="22"/>
+        </w:rPr>
+        <w:t xml:space="preserve"> — browse real careers, what they actually pay, and what they genuinely require, in plain language rather than dense job-spec jargon. Several careers also offer a spoken, personal walkthrough of what the role is really like day to day.</w:t>
       </w:r>
     </w:p>
     <w:p>
@@ -3976,16 +3998,27 @@
           <w:ilvl w:val="0"/>
           <w:numId w:val="3"/>
         </w:numPr>
-        <w:spacing w:after="100" w:line="280"/>
-      </w:pPr>
-      <w:r>
-        <w:rPr>
-          <w:rFonts w:ascii="Calibri" w:cs="Calibri" w:eastAsia="Calibri" w:hAnsi="Calibri"/>
-          <w:color w:val="1A1A1A"/>
-          <w:sz w:val="22"/>
-          <w:szCs w:val="22"/>
-        </w:rPr>
-        <w:t xml:space="preserve">Talk Practice — practise a spoken presentation with live feedback, with a browsable library of public talks from other users.</w:t>
+        <w:spacing w:after="140" w:line="280"/>
+      </w:pPr>
+      <w:r>
+        <w:rPr>
+          <w:rFonts w:ascii="Calibri" w:cs="Calibri" w:eastAsia="Calibri" w:hAnsi="Calibri"/>
+          <w:b/>
+          <w:bCs/>
+          <w:color w:val="1A1A1A"/>
+          <w:sz w:val="22"/>
+          <w:szCs w:val="22"/>
+        </w:rPr>
+        <w:t xml:space="preserve">Talk Practice</w:t>
+      </w:r>
+      <w:r>
+        <w:rPr>
+          <w:rFonts w:ascii="Calibri" w:cs="Calibri" w:eastAsia="Calibri" w:hAnsi="Calibri"/>
+          <w:color w:val="1A1A1A"/>
+          <w:sz w:val="22"/>
+          <w:szCs w:val="22"/>
+        </w:rPr>
+        <w:t xml:space="preserve"> — practise a spoken presentation or talk out loud, scored with the same rigour as an interview answer, with a browsable library of other users’ public talks to learn from. Aimed particularly at students and younger people who need presentation skills, not only interviews.</w:t>
       </w:r>
     </w:p>
     <w:p>
@@ -3995,16 +4028,27 @@
           <w:ilvl w:val="0"/>
           <w:numId w:val="3"/>
         </w:numPr>
-        <w:spacing w:after="100" w:line="280"/>
-      </w:pPr>
-      <w:r>
-        <w:rPr>
-          <w:rFonts w:ascii="Calibri" w:cs="Calibri" w:eastAsia="Calibri" w:hAnsi="Calibri"/>
-          <w:color w:val="1A1A1A"/>
-          <w:sz w:val="22"/>
-          <w:szCs w:val="22"/>
-        </w:rPr>
-        <w:t xml:space="preserve">Client Gifts — a recruiter gifts their hiring-manager client a genuinely useful set of free interview questions for a role, strengthening that relationship at zero cost.</w:t>
+        <w:spacing w:after="140" w:line="280"/>
+      </w:pPr>
+      <w:r>
+        <w:rPr>
+          <w:rFonts w:ascii="Calibri" w:cs="Calibri" w:eastAsia="Calibri" w:hAnsi="Calibri"/>
+          <w:b/>
+          <w:bCs/>
+          <w:color w:val="1A1A1A"/>
+          <w:sz w:val="22"/>
+          <w:szCs w:val="22"/>
+        </w:rPr>
+        <w:t xml:space="preserve">Client Gifts</w:t>
+      </w:r>
+      <w:r>
+        <w:rPr>
+          <w:rFonts w:ascii="Calibri" w:cs="Calibri" w:eastAsia="Calibri" w:hAnsi="Calibri"/>
+          <w:color w:val="1A1A1A"/>
+          <w:sz w:val="22"/>
+          <w:szCs w:val="22"/>
+        </w:rPr>
+        <w:t xml:space="preserve"> — a recruiter gifts their hiring-manager client a genuinely useful set of free, AI-written interview questions tailored to a specific role. Strengthens the recruiter’s own relationship with that client at zero extra cost, and is a natural companion to the Magic Button described above.</w:t>
       </w:r>
     </w:p>
     <w:p>
@@ -4014,16 +4058,27 @@
           <w:ilvl w:val="0"/>
           <w:numId w:val="3"/>
         </w:numPr>
-        <w:spacing w:after="100" w:line="280"/>
-      </w:pPr>
-      <w:r>
-        <w:rPr>
-          <w:rFonts w:ascii="Calibri" w:cs="Calibri" w:eastAsia="Calibri" w:hAnsi="Calibri"/>
-          <w:color w:val="1A1A1A"/>
-          <w:sz w:val="22"/>
-          <w:szCs w:val="22"/>
-        </w:rPr>
-        <w:t xml:space="preserve">Exams &amp; Certifications — 172 professional and school exam types, with scored mock papers; mock exams are free.</w:t>
+        <w:spacing w:after="140" w:line="280"/>
+      </w:pPr>
+      <w:r>
+        <w:rPr>
+          <w:rFonts w:ascii="Calibri" w:cs="Calibri" w:eastAsia="Calibri" w:hAnsi="Calibri"/>
+          <w:b/>
+          <w:bCs/>
+          <w:color w:val="1A1A1A"/>
+          <w:sz w:val="22"/>
+          <w:szCs w:val="22"/>
+        </w:rPr>
+        <w:t xml:space="preserve">Exams &amp; Certifications</w:t>
+      </w:r>
+      <w:r>
+        <w:rPr>
+          <w:rFonts w:ascii="Calibri" w:cs="Calibri" w:eastAsia="Calibri" w:hAnsi="Calibri"/>
+          <w:color w:val="1A1A1A"/>
+          <w:sz w:val="22"/>
+          <w:szCs w:val="22"/>
+        </w:rPr>
+        <w:t xml:space="preserve"> — 172 professional and school exam types, each with its own scored mock paper generated on demand. Mock exams are free, so a candidate can genuinely test their readiness before ever paying for anything.</w:t>
       </w:r>
     </w:p>
     <w:p>
@@ -4033,16 +4088,27 @@
           <w:ilvl w:val="0"/>
           <w:numId w:val="3"/>
         </w:numPr>
-        <w:spacing w:after="100" w:line="280"/>
-      </w:pPr>
-      <w:r>
-        <w:rPr>
-          <w:rFonts w:ascii="Calibri" w:cs="Calibri" w:eastAsia="Calibri" w:hAnsi="Calibri"/>
-          <w:color w:val="1A1A1A"/>
-          <w:sz w:val="22"/>
-          <w:szCs w:val="22"/>
-        </w:rPr>
-        <w:t xml:space="preserve">CV Analyser &amp; Salary Insights — upload a CV and see which roles genuinely fit, what they pay, and personal strengths and gaps, with a spoken walkthrough.</w:t>
+        <w:spacing w:after="140" w:line="280"/>
+      </w:pPr>
+      <w:r>
+        <w:rPr>
+          <w:rFonts w:ascii="Calibri" w:cs="Calibri" w:eastAsia="Calibri" w:hAnsi="Calibri"/>
+          <w:b/>
+          <w:bCs/>
+          <w:color w:val="1A1A1A"/>
+          <w:sz w:val="22"/>
+          <w:szCs w:val="22"/>
+        </w:rPr>
+        <w:t xml:space="preserve">CV Analyser &amp; Salary Insights</w:t>
+      </w:r>
+      <w:r>
+        <w:rPr>
+          <w:rFonts w:ascii="Calibri" w:cs="Calibri" w:eastAsia="Calibri" w:hAnsi="Calibri"/>
+          <w:color w:val="1A1A1A"/>
+          <w:sz w:val="22"/>
+          <w:szCs w:val="22"/>
+        </w:rPr>
+        <w:t xml:space="preserve"> — upload a CV and instantly see which roles genuinely fit, what they typically pay, and personal strengths and gaps, with a spoken walkthrough explaining the result rather than a wall of text. Results are saved and can be shared, the same way an interview result can.</w:t>
       </w:r>
     </w:p>
     <w:p>
@@ -4052,16 +4118,27 @@
           <w:ilvl w:val="0"/>
           <w:numId w:val="3"/>
         </w:numPr>
-        <w:spacing w:after="100" w:line="280"/>
-      </w:pPr>
-      <w:r>
-        <w:rPr>
-          <w:rFonts w:ascii="Calibri" w:cs="Calibri" w:eastAsia="Calibri" w:hAnsi="Calibri"/>
-          <w:color w:val="1A1A1A"/>
-          <w:sz w:val="22"/>
-          <w:szCs w:val="22"/>
-        </w:rPr>
-        <w:t xml:space="preserve">Interview Gifts — buy or send someone else a session pass as a genuinely useful gift.</w:t>
+        <w:spacing w:after="140" w:line="280"/>
+      </w:pPr>
+      <w:r>
+        <w:rPr>
+          <w:rFonts w:ascii="Calibri" w:cs="Calibri" w:eastAsia="Calibri" w:hAnsi="Calibri"/>
+          <w:b/>
+          <w:bCs/>
+          <w:color w:val="1A1A1A"/>
+          <w:sz w:val="22"/>
+          <w:szCs w:val="22"/>
+        </w:rPr>
+        <w:t xml:space="preserve">Interview Gifts</w:t>
+      </w:r>
+      <w:r>
+        <w:rPr>
+          <w:rFonts w:ascii="Calibri" w:cs="Calibri" w:eastAsia="Calibri" w:hAnsi="Calibri"/>
+          <w:color w:val="1A1A1A"/>
+          <w:sz w:val="22"/>
+          <w:szCs w:val="22"/>
+        </w:rPr>
+        <w:t xml:space="preserve"> — buy a session pass and send it to someone else facing an interview — a small, genuinely useful gift, handled by a proper checkout and email flow, not an afterthought bolted onto the site.</w:t>
       </w:r>
     </w:p>
     <w:p>
@@ -4071,16 +4148,27 @@
           <w:ilvl w:val="0"/>
           <w:numId w:val="3"/>
         </w:numPr>
-        <w:spacing w:after="100" w:line="280"/>
-      </w:pPr>
-      <w:r>
-        <w:rPr>
-          <w:rFonts w:ascii="Calibri" w:cs="Calibri" w:eastAsia="Calibri" w:hAnsi="Calibri"/>
-          <w:color w:val="1A1A1A"/>
-          <w:sz w:val="22"/>
-          <w:szCs w:val="22"/>
-        </w:rPr>
-        <w:t xml:space="preserve">Question Bank — save any model answer revealed during practice, to study again later.</w:t>
+        <w:spacing w:after="140" w:line="280"/>
+      </w:pPr>
+      <w:r>
+        <w:rPr>
+          <w:rFonts w:ascii="Calibri" w:cs="Calibri" w:eastAsia="Calibri" w:hAnsi="Calibri"/>
+          <w:b/>
+          <w:bCs/>
+          <w:color w:val="1A1A1A"/>
+          <w:sz w:val="22"/>
+          <w:szCs w:val="22"/>
+        </w:rPr>
+        <w:t xml:space="preserve">Question Bank</w:t>
+      </w:r>
+      <w:r>
+        <w:rPr>
+          <w:rFonts w:ascii="Calibri" w:cs="Calibri" w:eastAsia="Calibri" w:hAnsi="Calibri"/>
+          <w:color w:val="1A1A1A"/>
+          <w:sz w:val="22"/>
+          <w:szCs w:val="22"/>
+        </w:rPr>
+        <w:t xml:space="preserve"> — save any model answer revealed during practice into a personal, searchable library, to study and replay later. Turns a single practice session into an ongoing revision resource rather than a one-off event.</w:t>
       </w:r>
     </w:p>
     <w:p>
@@ -4090,16 +4178,27 @@
           <w:ilvl w:val="0"/>
           <w:numId w:val="3"/>
         </w:numPr>
-        <w:spacing w:after="100" w:line="280"/>
-      </w:pPr>
-      <w:r>
-        <w:rPr>
-          <w:rFonts w:ascii="Calibri" w:cs="Calibri" w:eastAsia="Calibri" w:hAnsi="Calibri"/>
-          <w:color w:val="1A1A1A"/>
-          <w:sz w:val="22"/>
-          <w:szCs w:val="22"/>
-        </w:rPr>
-        <w:t xml:space="preserve">Company-Specific Interviews — practise in the actual interview style of 68 named, real employers.</w:t>
+        <w:spacing w:after="140" w:line="280"/>
+      </w:pPr>
+      <w:r>
+        <w:rPr>
+          <w:rFonts w:ascii="Calibri" w:cs="Calibri" w:eastAsia="Calibri" w:hAnsi="Calibri"/>
+          <w:b/>
+          <w:bCs/>
+          <w:color w:val="1A1A1A"/>
+          <w:sz w:val="22"/>
+          <w:szCs w:val="22"/>
+        </w:rPr>
+        <w:t xml:space="preserve">Company-Specific Interviews</w:t>
+      </w:r>
+      <w:r>
+        <w:rPr>
+          <w:rFonts w:ascii="Calibri" w:cs="Calibri" w:eastAsia="Calibri" w:hAnsi="Calibri"/>
+          <w:color w:val="1A1A1A"/>
+          <w:sz w:val="22"/>
+          <w:szCs w:val="22"/>
+        </w:rPr>
+        <w:t xml:space="preserve"> — an “Interview Style” picker lets a candidate practise in the actual questioning style of 68 curated, real employers, each with its own AI-built company profile behind it — not a generic interview with a company’s name attached.</w:t>
       </w:r>
     </w:p>
     <w:p>
@@ -4109,16 +4208,27 @@
           <w:ilvl w:val="0"/>
           <w:numId w:val="3"/>
         </w:numPr>
-        <w:spacing w:after="100" w:line="280"/>
-      </w:pPr>
-      <w:r>
-        <w:rPr>
-          <w:rFonts w:ascii="Calibri" w:cs="Calibri" w:eastAsia="Calibri" w:hAnsi="Calibri"/>
-          <w:color w:val="1A1A1A"/>
-          <w:sz w:val="22"/>
-          <w:szCs w:val="22"/>
-        </w:rPr>
-        <w:t xml:space="preserve">Learn Alerts — spaced-repetition practice questions delivered by email, so what was learned does not quietly fade.</w:t>
+        <w:spacing w:after="140" w:line="280"/>
+      </w:pPr>
+      <w:r>
+        <w:rPr>
+          <w:rFonts w:ascii="Calibri" w:cs="Calibri" w:eastAsia="Calibri" w:hAnsi="Calibri"/>
+          <w:b/>
+          <w:bCs/>
+          <w:color w:val="1A1A1A"/>
+          <w:sz w:val="22"/>
+          <w:szCs w:val="22"/>
+        </w:rPr>
+        <w:t xml:space="preserve">Learn Alerts</w:t>
+      </w:r>
+      <w:r>
+        <w:rPr>
+          <w:rFonts w:ascii="Calibri" w:cs="Calibri" w:eastAsia="Calibri" w:hAnsi="Calibri"/>
+          <w:color w:val="1A1A1A"/>
+          <w:sz w:val="22"/>
+          <w:szCs w:val="22"/>
+        </w:rPr>
+        <w:t xml:space="preserve"> — spaced-repetition multiple-choice practice questions delivered by email on a schedule, so what was learned in a Learn session is revisited before it fades — the same underlying “interrogation keeps knowledge” principle behind The Loop, applied to ongoing study rather than a single interview.</w:t>
       </w:r>
     </w:p>
     <w:p>

</xml_diff>

<commit_message>
docs: business plan avatar cost updated - cut-off after each question, US$0.60 (HeyGen) and projected US$0.05-0.14 (Spatius)
Co-Authored-By: Claude Sonnet 5.5 <noreply@anthropic.com>
</commit_message>
<xml_diff>
--- a/docs/business-plan/TheInterviewChair-Business-Plan.docx
+++ b/docs/business-plan/TheInterviewChair-Business-Plan.docx
@@ -2116,7 +2116,7 @@
           <w:sz w:val="22"/>
           <w:szCs w:val="22"/>
         </w:rPr>
-        <w:t xml:space="preserve">The cost to run one full, ten-question live-avatar interview has been measured directly against the AI-avatar provider’s own usage figures, before and after a specific optimisation (disconnecting the avatar’s video/audio session during the candidate’s own thinking and answering time, when nothing needs to be streamed): approximately £0.60 per complete interview, an 85% reduction from the original ~£4.00 estimate. Text-based AI costs (scoring, coaching, question generation) are comparatively small — a fraction of a penny per exchange.</w:t>
+        <w:t xml:space="preserve">The cost to run one full, ten-question live-avatar interview has been measured directly against the AI-avatar provider’s own usage figures, before and after a specific optimisation: the avatar is connected only while it asks each question and is cut off the moment the question ends, so nothing is streamed during the candidate’s own thinking and answering time. On the original provider (HeyGen) this measured approximately US$0.60 per complete interview, an 85% reduction from the original ~US$4.00 estimate. The platform has since added a second, lower-cost avatar provider (Spatius, which renders the avatar on the viewer’s own device), switchable from the admin portal, with the original provider kept as an automatic backup. Using the same cut-off-after-each-question pattern, the projected cost is approximately US$0.05–US$0.14 per complete ten-question interview (based on the provider’s published rates and usage measured on the public demo; to be confirmed once full interviews run on the new provider). Provider costs are billed in US dollars. Text-based AI costs (scoring, coaching, question generation) are comparatively small — a fraction of a penny per exchange.</w:t>
       </w:r>
     </w:p>
     <w:p>
@@ -3636,7 +3636,7 @@
                 <w:sz w:val="19"/>
                 <w:szCs w:val="19"/>
               </w:rPr>
-              <w:t xml:space="preserve">Measured at ~£0.60 per full 10-question interview after disconnecting the avatar during answer time; margin is healthy at current pricing.</w:t>
+              <w:t xml:space="preserve">Measured at ~US$0.60 per full 10-question interview on the original provider, with the avatar cut off after each question; a lower-cost second provider projects at roughly US$0.05–US$0.14 per interview, with the original kept as automatic backup; margin is healthy at current pricing.</w:t>
             </w:r>
           </w:p>
         </w:tc>

</xml_diff>